<commit_message>
Rebuild STS and the browsable specification from 226bd57a
Generated by .github/workflows/publish.yml. Edit source/, model/ or
manifest.json — never artifacts/ or docs/, which the next build discards.
</commit_message>
<xml_diff>
--- a/artifacts/OPC-20020.docx
+++ b/artifacts/OPC-20020.docx
@@ -80,7 +80,7 @@
                                 <pic:cNvPicPr/>
                               </pic:nvPicPr>
                               <pic:blipFill>
-                                <a:blip r:embed="R048aa14a35614c4c"/>
+                                <a:blip r:embed="R153350db81464736"/>
                                 <a:stretch>
                                   <a:fillRect/>
                                 </a:stretch>
@@ -1398,7 +1398,7 @@
         <w:spacing w:before="60"/>
         <w:ind w:left="340"/>
       </w:pPr>
-      <w:hyperlink r:id="Rb0a6a49d20274817">
+      <w:hyperlink r:id="R527252e4be144eb7">
         <w:r>
           <w:rPr>
             <w:rStyle w:val="Hyperlink"/>
@@ -1433,7 +1433,7 @@
         <w:spacing w:before="60"/>
         <w:ind w:left="340"/>
       </w:pPr>
-      <w:hyperlink r:id="Rbb189f7fde8c486d">
+      <w:hyperlink r:id="Rccef71ad34024b2d">
         <w:r>
           <w:rPr>
             <w:rStyle w:val="Hyperlink"/>
@@ -1468,7 +1468,7 @@
         <w:spacing w:before="60"/>
         <w:ind w:left="340"/>
       </w:pPr>
-      <w:hyperlink r:id="R1a420554b0ad4f6b">
+      <w:hyperlink r:id="R615a5b0031f94e50">
         <w:r>
           <w:rPr>
             <w:rStyle w:val="Hyperlink"/>
@@ -1503,7 +1503,7 @@
         <w:spacing w:before="60"/>
         <w:ind w:left="340"/>
       </w:pPr>
-      <w:hyperlink r:id="Rb571a40207364f98">
+      <w:hyperlink r:id="R2935499018804e35">
         <w:r>
           <w:rPr>
             <w:rStyle w:val="Hyperlink"/>
@@ -1538,7 +1538,7 @@
         <w:spacing w:before="60"/>
         <w:ind w:left="340"/>
       </w:pPr>
-      <w:hyperlink r:id="Rb68661c93a9440b3">
+      <w:hyperlink r:id="R99cf7fb8c3054299">
         <w:r>
           <w:rPr>
             <w:rStyle w:val="Hyperlink"/>
@@ -1573,7 +1573,7 @@
         <w:spacing w:before="60"/>
         <w:ind w:left="340"/>
       </w:pPr>
-      <w:hyperlink r:id="R05d4c20ea1394fef">
+      <w:hyperlink r:id="Ra46fd5aa717540f1">
         <w:r>
           <w:rPr>
             <w:rStyle w:val="Hyperlink"/>
@@ -1608,7 +1608,7 @@
         <w:spacing w:before="60"/>
         <w:ind w:left="340"/>
       </w:pPr>
-      <w:hyperlink r:id="Rd373af51f35f46f3">
+      <w:hyperlink r:id="Rbefb3ea79ea54ad2">
         <w:r>
           <w:rPr>
             <w:rStyle w:val="Hyperlink"/>
@@ -1643,7 +1643,7 @@
         <w:spacing w:before="60"/>
         <w:ind w:left="340"/>
       </w:pPr>
-      <w:hyperlink r:id="Rbae895a1799b449c">
+      <w:hyperlink r:id="R98d3618027cf466b">
         <w:r>
           <w:rPr>
             <w:rStyle w:val="Hyperlink"/>
@@ -1678,7 +1678,7 @@
         <w:spacing w:before="60"/>
         <w:ind w:left="340"/>
       </w:pPr>
-      <w:hyperlink r:id="R56b135c80b614527">
+      <w:hyperlink r:id="Rab2a9fe18c0e4ba5">
         <w:r>
           <w:rPr>
             <w:rStyle w:val="Hyperlink"/>
@@ -1713,7 +1713,7 @@
         <w:spacing w:before="60"/>
         <w:ind w:left="340"/>
       </w:pPr>
-      <w:hyperlink r:id="R17ae545db78c4698">
+      <w:hyperlink r:id="Rfd724dc01ca84990">
         <w:r>
           <w:rPr>
             <w:rStyle w:val="Hyperlink"/>
@@ -1748,7 +1748,7 @@
         <w:spacing w:before="60"/>
         <w:ind w:left="340"/>
       </w:pPr>
-      <w:hyperlink r:id="R942b411d74244ec7">
+      <w:hyperlink r:id="Rb4460bb746534622">
         <w:r>
           <w:rPr>
             <w:rStyle w:val="Hyperlink"/>
@@ -2702,7 +2702,7 @@
                     <pic:cNvPicPr/>
                   </pic:nvPicPr>
                   <pic:blipFill>
-                    <a:blip r:embed="R879105042a414e51">
+                    <a:blip r:embed="R09e1c30d68354205">
                       <a:extLst>
                         <a:ext uri="{96DAC541-7B7A-43D3-8B79-37D633B846F1}">
                           <asvg:svgBlip xmlns:asvg="http://schemas.microsoft.com/office/drawing/2016/SVG/main" r:embed="rIdSvg2"/>
@@ -16868,7 +16868,7 @@
             <w:pPr>
               <w:pStyle w:val="TABLE-cell"/>
             </w:pPr>
-            <w:hyperlink r:id="R5c5832880a4045af">
+            <w:hyperlink r:id="R55a5d3d3848f4e57">
               <w:r>
                 <w:rPr>
                   <w:rStyle w:val="Hyperlink"/>
@@ -18629,7 +18629,7 @@
       <w:pPr>
         <w:pStyle w:val="PARAGRAPH"/>
       </w:pPr>
-      <w:hyperlink r:id="Rf54ea14e0a494151">
+      <w:hyperlink r:id="Raab7b1ba9aa042e4">
         <w:r>
           <w:rPr>
             <w:rStyle w:val="Hyperlink"/>
@@ -18656,7 +18656,7 @@
         <w:rPr/>
         <w:t xml:space="preserve"> can be found </w:t>
       </w:r>
-      <w:hyperlink r:id="Rdaeee8e193654e1a">
+      <w:hyperlink r:id="R2fc043e42d7048e5">
         <w:r>
           <w:rPr>
             <w:rStyle w:val="Hyperlink"/>
@@ -18682,7 +18682,7 @@
       <w:pPr>
         <w:pStyle w:val="PARAGRAPH"/>
       </w:pPr>
-      <w:hyperlink r:id="Rb5608362c98c47ec">
+      <w:hyperlink r:id="Ra1591ad1e7e44dd9">
         <w:r>
           <w:rPr>
             <w:rStyle w:val="Hyperlink"/>
@@ -18704,7 +18704,7 @@
       <w:pPr>
         <w:pStyle w:val="PARAGRAPH"/>
       </w:pPr>
-      <w:hyperlink r:id="R16c9ea2e91e3435a">
+      <w:hyperlink r:id="Re9c4eb9f6a4c43e5">
         <w:r>
           <w:rPr>
             <w:rStyle w:val="Hyperlink"/>
@@ -18726,7 +18726,7 @@
       <w:pPr>
         <w:pStyle w:val="PARAGRAPH"/>
       </w:pPr>
-      <w:hyperlink r:id="R4a14a2daeed14ec1">
+      <w:hyperlink r:id="Recf1d1dc5783412e">
         <w:r>
           <w:rPr>
             <w:rStyle w:val="Hyperlink"/>
@@ -18748,7 +18748,7 @@
       <w:pPr>
         <w:pStyle w:val="PARAGRAPH"/>
       </w:pPr>
-      <w:hyperlink r:id="R892d6bbcc0474646">
+      <w:hyperlink r:id="Re9967399a70645c5">
         <w:r>
           <w:rPr>
             <w:rStyle w:val="Hyperlink"/>

</xml_diff>